<commit_message>
Deployed e518e35 with MkDocs version: 1.6.1
</commit_message>
<xml_diff>
--- a/Bayerische Nächte/Geschichten/10_Spuren in der Bibliothek/Vorspann.docx
+++ b/Bayerische Nächte/Geschichten/10_Spuren in der Bibliothek/Vorspann.docx
@@ -9,21 +9,19 @@
           <w:bCs/>
         </w:rPr>
       </w:pPr>
-      <w:proofErr w:type="gramStart"/>
       <w:r>
         <w:rPr>
           <w:b/>
           <w:bCs/>
         </w:rPr>
-        <w:t>Auf der Ostfriesland</w:t>
-      </w:r>
-      <w:proofErr w:type="gramEnd"/>
+        <w:t>Auf der Ostfriesland, 08.05.188</w:t>
+      </w:r>
       <w:r>
         <w:rPr>
           <w:b/>
           <w:bCs/>
         </w:rPr>
-        <w:t>, 08.05.1882</w:t>
+        <w:t>3</w:t>
       </w:r>
     </w:p>
     <w:p/>
@@ -79,15 +77,7 @@
         <w:ind w:firstLine="708"/>
       </w:pPr>
       <w:r>
-        <w:t xml:space="preserve">Er schritt Richtung Ende des Schiffes, dort wo unter ihm der </w:t>
-      </w:r>
-      <w:proofErr w:type="spellStart"/>
-      <w:r>
-        <w:t>Speißesaal</w:t>
-      </w:r>
-      <w:proofErr w:type="spellEnd"/>
-      <w:r>
-        <w:t xml:space="preserve"> wartete. Heute eine Lücke in seinem Rundgang, vielleicht auch für morgen. Und übermorgen.</w:t>
+        <w:t>Er schritt Richtung Ende des Schiffes, dort wo unter ihm der Speißesaal wartete. Heute eine Lücke in seinem Rundgang, vielleicht auch für morgen. Und übermorgen.</w:t>
       </w:r>
       <w:r>
         <w:t xml:space="preserve"> Hier aßen die, die sich Nichts Besseres leisten konnten, die welche Überfahrt das Portemonnaie schon genug strapazierten. Ein Schritt beschleunigte sich leicht, in seinem Automatismus kaum merklich, sein Unterbewusstsein wollte einfach nur weg. Aber er nicht, als er sich zwang seinen Gang zu verlangsamen, zum fünften Mal, als er an einem Stück Papier </w:t>
@@ -124,18 +114,10 @@
         <w:ind w:firstLine="708"/>
       </w:pPr>
       <w:r>
-        <w:t xml:space="preserve">„Jens? Was willst du so </w:t>
-      </w:r>
-      <w:proofErr w:type="spellStart"/>
-      <w:r>
-        <w:t>s</w:t>
-      </w:r>
-      <w:r>
-        <w:t>pä</w:t>
-      </w:r>
-      <w:proofErr w:type="spellEnd"/>
-      <w:r>
-        <w:t>-</w:t>
+        <w:t>„Jens? Was willst du so s</w:t>
+      </w:r>
+      <w:r>
+        <w:t>pä-</w:t>
       </w:r>
       <w:r>
         <w:t>“ versuchte Jasper zu fragen, bevor ihn Jens das Wort abschnitt.</w:t>
@@ -236,26 +218,10 @@
         <w:ind w:firstLine="708"/>
       </w:pPr>
       <w:r>
-        <w:t xml:space="preserve">„Pfeifer, Doppler und </w:t>
-      </w:r>
-      <w:proofErr w:type="spellStart"/>
-      <w:r>
-        <w:t>Adamantidi</w:t>
-      </w:r>
-      <w:proofErr w:type="spellEnd"/>
-      <w:r>
-        <w:t>. Auf dem Weg nach Japan.</w:t>
-      </w:r>
-      <w:r>
-        <w:t xml:space="preserve"> Sie sehen aber nicht auf der Flucht oder </w:t>
-      </w:r>
-      <w:proofErr w:type="spellStart"/>
-      <w:r>
-        <w:t>entfü</w:t>
-      </w:r>
-      <w:proofErr w:type="spellEnd"/>
-      <w:r>
-        <w:t>-</w:t>
+        <w:t>„Pfeifer, Doppler und Adamantidi. Auf dem Weg nach Japan.</w:t>
+      </w:r>
+      <w:r>
+        <w:t xml:space="preserve"> Sie sehen aber nicht auf der Flucht oder entfü-</w:t>
       </w:r>
       <w:r>
         <w:t>“</w:t>
@@ -284,13 +250,8 @@
       <w:r>
         <w:t xml:space="preserve">„Vielen Dank, geben sie uns ihren Namen und Adresse, und wir werden sie bei </w:t>
       </w:r>
-      <w:proofErr w:type="spellStart"/>
-      <w:r>
-        <w:t>Beschtätigung</w:t>
-      </w:r>
-      <w:proofErr w:type="spellEnd"/>
-      <w:r>
-        <w:t xml:space="preserve"> </w:t>
+      <w:r>
+        <w:t xml:space="preserve">Beschtätigung </w:t>
       </w:r>
       <w:r>
         <w:t>entlohnen.“</w:t>

</xml_diff>